<commit_message>
add defferral on contract
</commit_message>
<xml_diff>
--- a/document_templates/CATs/CAT-contract.docx
+++ b/document_templates/CATs/CAT-contract.docx
@@ -1541,14 +1541,6 @@
         </w:tc>
       </w:tr>
       <w:tr>
-        <w:tblPrEx>
-          <w:tblCellMar>
-            <w:top w:w="0" w:type="dxa"/>
-            <w:left w:w="108" w:type="dxa"/>
-            <w:bottom w:w="0" w:type="dxa"/>
-            <w:right w:w="108" w:type="dxa"/>
-          </w:tblCellMar>
-        </w:tblPrEx>
         <w:trPr>
           <w:trHeight w:val="71" w:hRule="atLeast"/>
         </w:trPr>
@@ -2432,6 +2424,7 @@
                 <w:sz w:val="24"/>
                 <w:szCs w:val="24"/>
                 <w:highlight w:val="none"/>
+                <w:lang w:val="en-US"/>
               </w:rPr>
             </w:pPr>
             <w:r>
@@ -2442,9 +2435,9 @@
                 <w:sz w:val="24"/>
                 <w:szCs w:val="24"/>
                 <w:highlight w:val="none"/>
-                <w:lang w:eastAsia="fr-FR"/>
-              </w:rPr>
-              <w:t xml:space="preserve">${contract.verbal_trial.insurance_premium} </w:t>
+                <w:lang w:val="en-US" w:eastAsia="fr-FR"/>
+              </w:rPr>
+              <w:t>Selon la grille de l’assureur</w:t>
             </w:r>
           </w:p>
         </w:tc>
@@ -2552,7 +2545,31 @@
                 <w:highlight w:val="none"/>
                 <w:lang w:eastAsia="fr-FR"/>
               </w:rPr>
-              <w:t>Prime de risque (${contract.risk_premium_percentage}%)</w:t>
+              <w:t>Prime de risque (${contract</w:t>
+            </w:r>
+            <w:r>
+              <w:rPr>
+                <w:rFonts w:hint="default" w:ascii="Times New Roman" w:hAnsi="Times New Roman" w:cs="Times New Roman"/>
+                <w:b/>
+                <w:sz w:val="24"/>
+                <w:szCs w:val="24"/>
+                <w:highlight w:val="none"/>
+                <w:lang w:val="en-US" w:eastAsia="fr-FR"/>
+              </w:rPr>
+              <w:t>.verbal_trial</w:t>
+            </w:r>
+            <w:bookmarkStart w:id="0" w:name="_GoBack"/>
+            <w:bookmarkEnd w:id="0"/>
+            <w:r>
+              <w:rPr>
+                <w:rFonts w:hint="default" w:ascii="Times New Roman" w:hAnsi="Times New Roman" w:cs="Times New Roman"/>
+                <w:b/>
+                <w:sz w:val="24"/>
+                <w:szCs w:val="24"/>
+                <w:highlight w:val="none"/>
+                <w:lang w:eastAsia="fr-FR"/>
+              </w:rPr>
+              <w:t>.risk_premium_percentage}%)</w:t>
             </w:r>
           </w:p>
         </w:tc>
@@ -2588,7 +2605,29 @@
                 <w:highlight w:val="none"/>
                 <w:lang w:eastAsia="fr-FR"/>
               </w:rPr>
-              <w:t>${contract.risk_premium_percentage</w:t>
+              <w:t>${contract</w:t>
+            </w:r>
+            <w:r>
+              <w:rPr>
+                <w:rFonts w:hint="default" w:ascii="Times New Roman" w:hAnsi="Times New Roman" w:cs="Times New Roman"/>
+                <w:b/>
+                <w:sz w:val="24"/>
+                <w:szCs w:val="24"/>
+                <w:highlight w:val="none"/>
+                <w:lang w:val="en-US" w:eastAsia="fr-FR"/>
+              </w:rPr>
+              <w:t>.verbal_trial</w:t>
+            </w:r>
+            <w:r>
+              <w:rPr>
+                <w:rFonts w:hint="default" w:ascii="Times New Roman" w:hAnsi="Times New Roman" w:cs="Times New Roman"/>
+                <w:b/>
+                <w:sz w:val="24"/>
+                <w:szCs w:val="24"/>
+                <w:highlight w:val="none"/>
+                <w:lang w:eastAsia="fr-FR"/>
+              </w:rPr>
+              <w:t>.risk_premium_percentage</w:t>
             </w:r>
             <w:r>
               <w:rPr>
@@ -2712,21 +2751,7 @@
                 <w:highlight w:val="none"/>
                 <w:lang w:val="en-US" w:eastAsia="fr-FR"/>
               </w:rPr>
-              <w:t>${guarantees_total_amount</w:t>
-            </w:r>
-            <w:bookmarkStart w:id="0" w:name="_GoBack"/>
-            <w:bookmarkEnd w:id="0"/>
-            <w:r>
-              <w:rPr>
-                <w:rFonts w:hint="default" w:ascii="Times New Roman" w:hAnsi="Times New Roman" w:cs="Times New Roman"/>
-                <w:b/>
-                <w:bCs/>
-                <w:sz w:val="24"/>
-                <w:szCs w:val="24"/>
-                <w:highlight w:val="none"/>
-                <w:lang w:val="en-US" w:eastAsia="fr-FR"/>
-              </w:rPr>
-              <w:t>} FCFA</w:t>
+              <w:t>${guarantees_total_amount} FCFA</w:t>
             </w:r>
           </w:p>
         </w:tc>

</xml_diff>

<commit_message>
add pourcentage depot de garantie pour cat
</commit_message>
<xml_diff>
--- a/document_templates/CATs/CAT-contract.docx
+++ b/document_templates/CATs/CAT-contract.docx
@@ -234,6 +234,14 @@
         </w:tc>
       </w:tr>
       <w:tr>
+        <w:tblPrEx>
+          <w:tblCellMar>
+            <w:top w:w="0" w:type="dxa"/>
+            <w:left w:w="108" w:type="dxa"/>
+            <w:bottom w:w="0" w:type="dxa"/>
+            <w:right w:w="108" w:type="dxa"/>
+          </w:tblCellMar>
+        </w:tblPrEx>
         <w:trPr>
           <w:trHeight w:val="279" w:hRule="atLeast"/>
         </w:trPr>
@@ -327,6 +335,14 @@
         </w:tc>
       </w:tr>
       <w:tr>
+        <w:tblPrEx>
+          <w:tblCellMar>
+            <w:top w:w="0" w:type="dxa"/>
+            <w:left w:w="108" w:type="dxa"/>
+            <w:bottom w:w="0" w:type="dxa"/>
+            <w:right w:w="108" w:type="dxa"/>
+          </w:tblCellMar>
+        </w:tblPrEx>
         <w:trPr>
           <w:trHeight w:val="279" w:hRule="atLeast"/>
         </w:trPr>
@@ -408,6 +424,14 @@
         </w:tc>
       </w:tr>
       <w:tr>
+        <w:tblPrEx>
+          <w:tblCellMar>
+            <w:top w:w="0" w:type="dxa"/>
+            <w:left w:w="108" w:type="dxa"/>
+            <w:bottom w:w="0" w:type="dxa"/>
+            <w:right w:w="108" w:type="dxa"/>
+          </w:tblCellMar>
+        </w:tblPrEx>
         <w:trPr>
           <w:trHeight w:val="279" w:hRule="atLeast"/>
         </w:trPr>
@@ -488,6 +512,14 @@
         </w:tc>
       </w:tr>
       <w:tr>
+        <w:tblPrEx>
+          <w:tblCellMar>
+            <w:top w:w="0" w:type="dxa"/>
+            <w:left w:w="108" w:type="dxa"/>
+            <w:bottom w:w="0" w:type="dxa"/>
+            <w:right w:w="108" w:type="dxa"/>
+          </w:tblCellMar>
+        </w:tblPrEx>
         <w:trPr>
           <w:trHeight w:val="371" w:hRule="atLeast"/>
         </w:trPr>
@@ -2854,7 +2886,45 @@
                 <w:highlight w:val="none"/>
                 <w:lang w:eastAsia="fr-FR"/>
               </w:rPr>
-              <w:t>Dépôt de garantie 20%</w:t>
+              <w:t xml:space="preserve">Dépôt de garantie </w:t>
+            </w:r>
+            <w:r>
+              <w:rPr>
+                <w:rFonts w:hint="default" w:ascii="Times New Roman" w:hAnsi="Times New Roman" w:cs="Times New Roman"/>
+                <w:b/>
+                <w:color w:val="FFC000"/>
+                <w:sz w:val="24"/>
+                <w:szCs w:val="24"/>
+                <w:highlight w:val="none"/>
+                <w:lang w:val="en-US" w:eastAsia="fr-FR"/>
+              </w:rPr>
+              <w:t>${security_deposit_percentage</w:t>
+            </w:r>
+            <w:bookmarkStart w:id="0" w:name="_GoBack"/>
+            <w:bookmarkEnd w:id="0"/>
+            <w:r>
+              <w:rPr>
+                <w:rFonts w:hint="default" w:ascii="Times New Roman" w:hAnsi="Times New Roman" w:cs="Times New Roman"/>
+                <w:b/>
+                <w:color w:val="FFC000"/>
+                <w:sz w:val="24"/>
+                <w:szCs w:val="24"/>
+                <w:highlight w:val="none"/>
+                <w:lang w:val="en-US" w:eastAsia="fr-FR"/>
+              </w:rPr>
+              <w:t>}</w:t>
+            </w:r>
+            <w:r>
+              <w:rPr>
+                <w:rFonts w:hint="default" w:ascii="Times New Roman" w:hAnsi="Times New Roman" w:cs="Times New Roman"/>
+                <w:b/>
+                <w:color w:val="FFC000"/>
+                <w:sz w:val="24"/>
+                <w:szCs w:val="24"/>
+                <w:highlight w:val="none"/>
+                <w:lang w:eastAsia="fr-FR"/>
+              </w:rPr>
+              <w:t>%</w:t>
             </w:r>
           </w:p>
         </w:tc>
@@ -3467,8 +3537,6 @@
                 <w:highlight w:val="none"/>
               </w:rPr>
             </w:pPr>
-            <w:bookmarkStart w:id="0" w:name="_GoBack"/>
-            <w:bookmarkEnd w:id="0"/>
           </w:p>
         </w:tc>
         <w:tc>

</xml_diff>